<commit_message>
Add POI coding dictionary and remove reviewer notes from POI descriptions
Commit the downloaded dictionary with the poi tab, which the previous commit omitted. Regenerate the cleaned data and Supplementary Table 3 after removing three linkage notes from the coding sheet.
</commit_message>
<xml_diff>
--- a/outputs/tables/Supp_Table3_POI_Data_Sources.docx
+++ b/outputs/tables/Supp_Table3_POI_Data_Sources.docx
@@ -1818,7 +1818,7 @@
                 <w:szCs w:val="18"/>
                 <w:color w:val="000000"/>
               </w:rPr>
-              <w:t xml:space="preserve">Business records classified by NAICS code (dataset not named); tobacco stores only; coordinates from records; [linkage: check paper].</w:t>
+              <w:t xml:space="preserve">Business records classified by NAICS code (dataset not named); tobacco stores only; coordinates from records.</w:t>
             </w:r>
           </w:p>
         </w:tc>
@@ -5418,7 +5418,7 @@
                 <w:szCs w:val="18"/>
                 <w:color w:val="000000"/>
               </w:rPr>
-              <w:t xml:space="preserve">Connecticut Department of Consumer Protection licensed alcohol outlets (bars/clubs, restaurants, supermarkets, package stores), plus American Community Survey tract data and CDC Social Vulnerability Index; [linkage: check paper].</w:t>
+              <w:t xml:space="preserve">Connecticut Department of Consumer Protection licensed alcohol outlets (bars/clubs, restaurants, supermarkets, package stores), plus American Community Survey tract data and CDC Social Vulnerability Index.</w:t>
             </w:r>
           </w:p>
         </w:tc>
@@ -5643,7 +5643,7 @@
                 <w:szCs w:val="18"/>
                 <w:color w:val="000000"/>
               </w:rPr>
-              <w:t xml:space="preserve">OpenStreetMap and Kulturatlas Mannheim, plus participant-reported frequently visited places; bars, clubs, parks and other trigger points grouped into five categories (nightlife, culture, leisure, peers, meeting spots); [linkage: check paper].</w:t>
+              <w:t xml:space="preserve">OpenStreetMap and Kulturatlas Mannheim, plus participant-reported frequently visited places; bars, clubs, parks and other trigger points grouped into five categories (nightlife, culture, leisure, peers, meeting spots).</w:t>
             </w:r>
           </w:p>
         </w:tc>

</xml_diff>